<commit_message>
Implemented complaints module, made yearlevel into dropodown with numbers. Disabled monitored by field in the public forms for lab req, and equipment borrow, only editable when e-forum is selected. Lab request usage_type shows/hide printing pages field. The usage_type in lab request can now export specific files(faculty/student printing). Removed password plain text for saved/auto-complete/dropdown when clicking pw field. Removed session storage of pw to remove pw in the field when logging out.  Recurring bugs fixes from other modules. Added complaints in archive. Implemented duplicate asset detection when submitting in complaints. Converted the display card into tables in forms and complaints management which has now consistent UI for admin and custodian. Buttons, Icons, and colors are consistent too. Complaints status and UI adjustments. Improved complaints display modal. user_type is positioned first than name field. Name field now capitalizes every first letter.
</commit_message>
<xml_diff>
--- a/frontend/public/LDCU-Forms-CIT-034-Laboratory and E-Forum Usage Request Faculty.docx
+++ b/frontend/public/LDCU-Forms-CIT-034-Laboratory and E-Forum Usage Request Faculty.docx
@@ -222,16 +222,7 @@
           <w:szCs w:val="18"/>
         </w:rPr>
         <w:tab/>
-        <w:t xml:space="preserve">                  Printing-No. Pages: </w:t>
-      </w:r>
-      <w:r>
-        <w:rPr>
-          <w:rFonts w:eastAsia="Cambria" w:cs="Cambria" w:ascii="Cambria" w:hAnsi="Cambria"/>
-          <w:sz w:val="18"/>
-          <w:szCs w:val="18"/>
-          <w:u w:val="single"/>
-        </w:rPr>
-        <w:t>{printing_pages}</w:t>
+        <w:t xml:space="preserve">                  </w:t>
       </w:r>
     </w:p>
     <w:p>

</xml_diff>